<commit_message>
MSE2: tuned baselines, cross-dataset eval, evidence pipeline + offline API, LIAR head, DistilBERT sweep, Live Claims Set, paper §III–VI
- GridSearchCV NB/LR/SVM (raw cv_results_ CSVs), test metrics, CM/ROC, cross-dataset
  WELFake∖ISOT ↔ ISOT, artefact-only audit, error analysis (make tune-baselines / eval-models)
- Offline FAISS index (make index), online retrieval, NLI stance + FEVER eval (0.727, misses O4),
  claims, temporal, fusion R0–R9, FastAPI /health /classify /analyze (MODE=offline, make run)
- LIAR 3-way head; DistilBERT 20k-subset sweep (3 runs @256; full retrain deferred to ESE)
- Live Claims Set: 95 verified fact-checks (30 dev / 65 eval)
- Notebooks 03–05, paper §III–VI, MSE2 DoD status, stance pre-training doc fix

Co-Authored-By: Claude Opus 5.5 <noreply@anthropic.com>
</commit_message>
<xml_diff>
--- a/docs/milestones/MSE2_ProjectDetails.docx
+++ b/docs/milestones/MSE2_ProjectDetails.docx
@@ -232,6 +232,117 @@
         </w:p>
       </w:sdtContent>
     </w:sdt>
+    <w:p>
+      <w:pPr>
+        <w:pStyle w:val="BlockText"/>
+      </w:pPr>
+      <w:r>
+        <w:rPr>
+          <w:bCs/>
+          <w:b/>
+        </w:rPr>
+        <w:t xml:space="preserve">Status (2026-10-26, integration pass):</w:t>
+      </w:r>
+      <w:r>
+        <w:t xml:space="preserve"> </w:t>
+      </w:r>
+      <w:r>
+        <w:t xml:space="preserve">classical models tuned + tested (GridSearchCV NB 18 / LR 36 / SVM 36 configs, all completed), cross-dataset WELFake∖ISOT ↔ ISOT table, leakage audit, error analysis, LIAR 3-way head, zero-shot FEVER stance eval (0.7267 — misses O4), offline FAISS index, claims/temporal/fusion v1 and</w:t>
+      </w:r>
+      <w:r>
+        <w:t xml:space="preserve"> </w:t>
+      </w:r>
+      <w:r>
+        <w:rPr>
+          <w:rStyle w:val="VerbatimChar"/>
+        </w:rPr>
+        <w:t xml:space="preserve">POST /analyze</w:t>
+      </w:r>
+      <w:r>
+        <w:t xml:space="preserve"> </w:t>
+      </w:r>
+      <w:r>
+        <w:t xml:space="preserve">(offline) are</w:t>
+      </w:r>
+      <w:r>
+        <w:t xml:space="preserve"> </w:t>
+      </w:r>
+      <w:r>
+        <w:rPr>
+          <w:bCs/>
+          <w:b/>
+        </w:rPr>
+        <w:t xml:space="preserve">done</w:t>
+      </w:r>
+      <w:r>
+        <w:t xml:space="preserve">; Live Claims Set = 95 items; paper §III–VI drafted (</w:t>
+      </w:r>
+      <w:r>
+        <w:rPr>
+          <w:rStyle w:val="VerbatimChar"/>
+        </w:rPr>
+        <w:t xml:space="preserve">make paper</w:t>
+      </w:r>
+      <w:r>
+        <w:t xml:space="preserve"> </w:t>
+      </w:r>
+      <w:r>
+        <w:t xml:space="preserve">builds, 8 pp.).</w:t>
+      </w:r>
+      <w:r>
+        <w:t xml:space="preserve"> </w:t>
+      </w:r>
+      <w:r>
+        <w:rPr>
+          <w:bCs/>
+          <w:b/>
+        </w:rPr>
+        <w:t xml:space="preserve">Deferred to ESE (user decision 2026-10-26: no more GPU training):</w:t>
+      </w:r>
+      <w:r>
+        <w:t xml:space="preserve"> </w:t>
+      </w:r>
+      <w:r>
+        <w:t xml:space="preserve">DistilBERT max_len-512 runs, full-train retrain, DistilBERT test row and the O1 check (</w:t>
+      </w:r>
+      <w:r>
+        <w:rPr>
+          <w:rStyle w:val="VerbatimChar"/>
+        </w:rPr>
+        <w:t xml:space="preserve">data/models/distilbert-welfake-v1/</w:t>
+      </w:r>
+      <w:r>
+        <w:t xml:space="preserve"> </w:t>
+      </w:r>
+      <w:r>
+        <w:t xml:space="preserve">does not exist; the served classifier is TF-IDF + LR).</w:t>
+      </w:r>
+      <w:r>
+        <w:t xml:space="preserve"> </w:t>
+      </w:r>
+      <w:r>
+        <w:rPr>
+          <w:bCs/>
+          <w:b/>
+        </w:rPr>
+        <w:t xml:space="preserve">Not done yet:</w:t>
+      </w:r>
+      <w:r>
+        <w:t xml:space="preserve"> </w:t>
+      </w:r>
+      <w:r>
+        <w:rPr>
+          <w:rStyle w:val="VerbatimChar"/>
+        </w:rPr>
+        <w:t xml:space="preserve">docs/results/fusion_thresholds.md</w:t>
+      </w:r>
+      <w:r>
+        <w:t xml:space="preserve"> </w:t>
+      </w:r>
+      <w:r>
+        <w:t xml:space="preserve">(fusion.yaml values are untuned defaults) and all end-to-end numbers. Each DoD box below is ticked only if genuinely done; open boxes carry the reason.</w:t>
+      </w:r>
+    </w:p>
     <w:bookmarkStart w:id="21" w:name="title-block"/>
     <w:p>
       <w:pPr>
@@ -1799,7 +1910,7 @@
         <w:pStyle w:val="Compact"/>
       </w:pPr>
       <w:r>
-        <w:t xml:space="preserve">☐</w:t>
+        <w:t xml:space="preserve">☒</w:t>
       </w:r>
       <w:r>
         <w:t xml:space="preserve"> </w:t>
@@ -1830,6 +1941,16 @@
       </w:r>
       <w:r>
         <w:t xml:space="preserve">files.</w:t>
+      </w:r>
+      <w:r>
+        <w:t xml:space="preserve"> </w:t>
+      </w:r>
+      <w:r>
+        <w:rPr>
+          <w:iCs/>
+          <w:i/>
+        </w:rPr>
+        <w:t xml:space="preserve">(~2 min CPU; fresh clone verified at MSE1)</w:t>
       </w:r>
     </w:p>
     <w:p>
@@ -1880,7 +2001,38 @@
         <w:t xml:space="preserve">POST /classify</w:t>
       </w:r>
       <w:r>
-        <w:t xml:space="preserve">.</w:t>
+        <w:t xml:space="preserve">. —</w:t>
+      </w:r>
+      <w:r>
+        <w:t xml:space="preserve"> </w:t>
+      </w:r>
+      <w:r>
+        <w:rPr>
+          <w:bCs/>
+          <w:b/>
+        </w:rPr>
+        <w:t xml:space="preserve">deferred to ESE</w:t>
+      </w:r>
+      <w:r>
+        <w:t xml:space="preserve"> </w:t>
+      </w:r>
+      <w:r>
+        <w:t xml:space="preserve">(GPU training stopped 2026-10-26; full retrain not run;</w:t>
+      </w:r>
+      <w:r>
+        <w:t xml:space="preserve"> </w:t>
+      </w:r>
+      <w:r>
+        <w:rPr>
+          <w:rStyle w:val="VerbatimChar"/>
+        </w:rPr>
+        <w:t xml:space="preserve">/classify</w:t>
+      </w:r>
+      <w:r>
+        <w:t xml:space="preserve"> </w:t>
+      </w:r>
+      <w:r>
+        <w:t xml:space="preserve">serves TF-IDF + LR and switches automatically once the checkpoint exists).</w:t>
       </w:r>
     </w:p>
     <w:p>
@@ -1923,7 +2075,20 @@
         <w:t xml:space="preserve"> </w:t>
       </w:r>
       <w:r>
-        <w:t xml:space="preserve">with seed, full config, wall-clock, hardware (GPU/CPU/Colab) and per-epoch metrics.</w:t>
+        <w:t xml:space="preserve">with seed, full config, wall-clock, hardware (GPU/CPU/Colab) and per-epoch metrics. — logs exist for every model that was trained (baselines, tuned baselines, 3 DistilBERT sweep runs, LIAR head); the full DistilBERT run is</w:t>
+      </w:r>
+      <w:r>
+        <w:t xml:space="preserve"> </w:t>
+      </w:r>
+      <w:r>
+        <w:rPr>
+          <w:bCs/>
+          <w:b/>
+        </w:rPr>
+        <w:t xml:space="preserve">deferred to ESE</w:t>
+      </w:r>
+      <w:r>
+        <w:t xml:space="preserve">.</w:t>
       </w:r>
     </w:p>
     <w:p>
@@ -1950,7 +2115,30 @@
         <w:t xml:space="preserve"> </w:t>
       </w:r>
       <w:r>
-        <w:t xml:space="preserve">shows train loss decreasing and val macro-F1 per epoch; best epoch marked.</w:t>
+        <w:t xml:space="preserve">shows train loss decreasing and val macro-F1 per epoch; best epoch marked. — figure exists but shows the best</w:t>
+      </w:r>
+      <w:r>
+        <w:t xml:space="preserve"> </w:t>
+      </w:r>
+      <w:r>
+        <w:rPr>
+          <w:bCs/>
+          <w:b/>
+        </w:rPr>
+        <w:t xml:space="preserve">20k-subset sweep run</w:t>
+      </w:r>
+      <w:r>
+        <w:t xml:space="preserve">, not a full-train run (</w:t>
+      </w:r>
+      <w:r>
+        <w:rPr>
+          <w:bCs/>
+          <w:b/>
+        </w:rPr>
+        <w:t xml:space="preserve">deferred to ESE</w:t>
+      </w:r>
+      <w:r>
+        <w:t xml:space="preserve">).</w:t>
       </w:r>
     </w:p>
     <w:p>
@@ -1962,7 +2150,40 @@
         <w:pStyle w:val="Compact"/>
       </w:pPr>
       <w:r>
-        <w:t xml:space="preserve">☐ Stance model evaluated on the 3k FEVER dev subset; table + CM saved; accuracy reported against the O4 target (≥ 85 %).</w:t>
+        <w:t xml:space="preserve">☒ Stance model evaluated on the 3k FEVER dev subset; table + CM saved; accuracy reported against the O4 target (≥ 85 %).</w:t>
+      </w:r>
+      <w:r>
+        <w:t xml:space="preserve"> </w:t>
+      </w:r>
+      <w:r>
+        <w:rPr>
+          <w:iCs/>
+          <w:i/>
+        </w:rPr>
+        <w:t xml:space="preserve">(0.7267 zero-shot — O4</w:t>
+      </w:r>
+      <w:r>
+        <w:rPr>
+          <w:iCs/>
+          <w:i/>
+        </w:rPr>
+        <w:t xml:space="preserve"> </w:t>
+      </w:r>
+      <w:r>
+        <w:rPr>
+          <w:bCs/>
+          <w:b/>
+          <w:iCs/>
+          <w:i/>
+        </w:rPr>
+        <w:t xml:space="preserve">not met</w:t>
+      </w:r>
+      <w:r>
+        <w:rPr>
+          <w:iCs/>
+          <w:i/>
+        </w:rPr>
+        <w:t xml:space="preserve">, stated in the paper)</w:t>
       </w:r>
     </w:p>
     <w:p>
@@ -1974,7 +2195,7 @@
         <w:pStyle w:val="Compact"/>
       </w:pPr>
       <w:r>
-        <w:t xml:space="preserve">☐</w:t>
+        <w:t xml:space="preserve">☒</w:t>
       </w:r>
       <w:r>
         <w:t xml:space="preserve"> </w:t>
@@ -2005,6 +2226,16 @@
       </w:r>
       <w:r>
         <w:t xml:space="preserve">in &lt; 5 min; a query returns top-5 hits with cosine scores and record IDs.</w:t>
+      </w:r>
+      <w:r>
+        <w:t xml:space="preserve"> </w:t>
+      </w:r>
+      <w:r>
+        <w:rPr>
+          <w:iCs/>
+          <w:i/>
+        </w:rPr>
+        <w:t xml:space="preserve">(83.6 s, 13,892 vectors)</w:t>
       </w:r>
     </w:p>
     <w:p>
@@ -2016,7 +2247,7 @@
         <w:pStyle w:val="Compact"/>
       </w:pPr>
       <w:r>
-        <w:t xml:space="preserve">☐ All models use the same</w:t>
+        <w:t xml:space="preserve">☒ All models use the same</w:t>
       </w:r>
       <w:r>
         <w:t xml:space="preserve"> </w:t>
@@ -2374,7 +2605,23 @@
         <w:t xml:space="preserve"> </w:t>
       </w:r>
       <w:r>
-        <w:t xml:space="preserve">is pre-trained on SNLI/MNLI/FEVER-NLI; we evaluate it (premise = evidence, hypothesis = claim; entailment/contradiction/neutral → SUPPORTS/REFUTES/NEUTRAL). A 1-epoch fine-tune on 20k FEVER pairs is optional.</w:t>
+        <w:t xml:space="preserve">is pre-trained on SNLI + MultiNLI only (model card;</w:t>
+      </w:r>
+      <w:r>
+        <w:t xml:space="preserve"> </w:t>
+      </w:r>
+      <w:r>
+        <w:rPr>
+          <w:iCs/>
+          <w:i/>
+        </w:rPr>
+        <w:t xml:space="preserve">not</w:t>
+      </w:r>
+      <w:r>
+        <w:t xml:space="preserve"> </w:t>
+      </w:r>
+      <w:r>
+        <w:t xml:space="preserve">FEVER-NLI, as earlier drafts wrongly said), so our FEVER evaluation is zero-shot; we evaluate it (premise = evidence, hypothesis = claim; entailment/contradiction/neutral → SUPPORTS/REFUTES/NEUTRAL). A 1-epoch fine-tune on 20k FEVER pairs is optional.</w:t>
       </w:r>
     </w:p>
     <w:p>
@@ -2806,7 +3053,7 @@
         <w:pStyle w:val="Compact"/>
       </w:pPr>
       <w:r>
-        <w:t xml:space="preserve">☐ Tuning tables list</w:t>
+        <w:t xml:space="preserve">☒ Tuning tables list</w:t>
       </w:r>
       <w:r>
         <w:t xml:space="preserve"> </w:t>
@@ -2823,6 +3070,38 @@
       </w:r>
       <w:r>
         <w:t xml:space="preserve">configuration tried (no cherry-picking) with val macro-F1; the winner is marked and its val-vs-test gap is reported.</w:t>
+      </w:r>
+      <w:r>
+        <w:t xml:space="preserve"> </w:t>
+      </w:r>
+      <w:r>
+        <w:rPr>
+          <w:iCs/>
+          <w:i/>
+        </w:rPr>
+        <w:t xml:space="preserve">(classical: gap column in</w:t>
+      </w:r>
+      <w:r>
+        <w:rPr>
+          <w:iCs/>
+          <w:i/>
+        </w:rPr>
+        <w:t xml:space="preserve"> </w:t>
+      </w:r>
+      <w:r>
+        <w:rPr>
+          <w:rStyle w:val="VerbatimChar"/>
+          <w:iCs/>
+          <w:i/>
+        </w:rPr>
+        <w:t xml:space="preserve">classifier_table.md</w:t>
+      </w:r>
+      <w:r>
+        <w:rPr>
+          <w:iCs/>
+          <w:i/>
+        </w:rPr>
+        <w:t xml:space="preserve">; DistilBERT: no test number yet — ESE)</w:t>
       </w:r>
     </w:p>
     <w:p>
@@ -2834,7 +3113,7 @@
         <w:pStyle w:val="Compact"/>
       </w:pPr>
       <w:r>
-        <w:t xml:space="preserve">☐</w:t>
+        <w:t xml:space="preserve">☒</w:t>
       </w:r>
       <w:r>
         <w:t xml:space="preserve"> </w:t>
@@ -2876,7 +3155,7 @@
         <w:pStyle w:val="Compact"/>
       </w:pPr>
       <w:r>
-        <w:t xml:space="preserve">☐</w:t>
+        <w:t xml:space="preserve">☒</w:t>
       </w:r>
       <w:r>
         <w:t xml:space="preserve"> </w:t>
@@ -2892,6 +3171,16 @@
       </w:r>
       <w:r>
         <w:t xml:space="preserve">includes the lr = 5e-5 runs and a one-line explanation of their behaviour.</w:t>
+      </w:r>
+      <w:r>
+        <w:t xml:space="preserve"> </w:t>
+      </w:r>
+      <w:r>
+        <w:rPr>
+          <w:iCs/>
+          <w:i/>
+        </w:rPr>
+        <w:t xml:space="preserve">(max_len 256 only; 512 deferred to ESE)</w:t>
       </w:r>
     </w:p>
     <w:p>
@@ -2930,7 +3219,23 @@
         <w:t xml:space="preserve">train_logs</w:t>
       </w:r>
       <w:r>
-        <w:t xml:space="preserve">).</w:t>
+        <w:t xml:space="preserve">). —</w:t>
+      </w:r>
+      <w:r>
+        <w:t xml:space="preserve"> </w:t>
+      </w:r>
+      <w:r>
+        <w:rPr>
+          <w:bCs/>
+          <w:b/>
+        </w:rPr>
+        <w:t xml:space="preserve">deferred to ESE</w:t>
+      </w:r>
+      <w:r>
+        <w:t xml:space="preserve"> </w:t>
+      </w:r>
+      <w:r>
+        <w:t xml:space="preserve">(3 of 6 configs run, no winner, no retrain).</w:t>
       </w:r>
     </w:p>
     <w:p>
@@ -2969,7 +3274,44 @@
         <w:t xml:space="preserve">docs/results/fusion_thresholds.md</w:t>
       </w:r>
       <w:r>
-        <w:t xml:space="preserve">; dev slice IDs are disjoint from evaluation items.</w:t>
+        <w:t xml:space="preserve">; dev slice IDs are disjoint from evaluation items. — dev/eval slices are disjoint (</w:t>
+      </w:r>
+      <w:r>
+        <w:rPr>
+          <w:rStyle w:val="VerbatimChar"/>
+        </w:rPr>
+        <w:t xml:space="preserve">tests/test_live_claims.py</w:t>
+      </w:r>
+      <w:r>
+        <w:t xml:space="preserve">), but</w:t>
+      </w:r>
+      <w:r>
+        <w:t xml:space="preserve"> </w:t>
+      </w:r>
+      <w:r>
+        <w:rPr>
+          <w:rStyle w:val="VerbatimChar"/>
+          <w:bCs/>
+          <w:b/>
+        </w:rPr>
+        <w:t xml:space="preserve">fusion_thresholds.md</w:t>
+      </w:r>
+      <w:r>
+        <w:rPr>
+          <w:bCs/>
+          <w:b/>
+        </w:rPr>
+        <w:t xml:space="preserve"> </w:t>
+      </w:r>
+      <w:r>
+        <w:rPr>
+          <w:bCs/>
+          <w:b/>
+        </w:rPr>
+        <w:t xml:space="preserve">not produced yet</w:t>
+      </w:r>
+      <w:r>
+        <w:t xml:space="preserve">: fusion.yaml holds untuned defaults (τ 0.6, N 6, k 5).</w:t>
       </w:r>
     </w:p>
     <w:p>
@@ -2981,7 +3323,7 @@
         <w:pStyle w:val="Compact"/>
       </w:pPr>
       <w:r>
-        <w:t xml:space="preserve">☐</w:t>
+        <w:t xml:space="preserve">☒</w:t>
       </w:r>
       <w:r>
         <w:t xml:space="preserve"> </w:t>
@@ -2997,6 +3339,38 @@
       </w:r>
       <w:r>
         <w:t xml:space="preserve">regenerates the sweep figures from the CSV/MD tables.</w:t>
+      </w:r>
+      <w:r>
+        <w:t xml:space="preserve"> </w:t>
+      </w:r>
+      <w:r>
+        <w:rPr>
+          <w:iCs/>
+          <w:i/>
+        </w:rPr>
+        <w:t xml:space="preserve">(classical heat-maps; the DistilBERT sweep plot is rendered by</w:t>
+      </w:r>
+      <w:r>
+        <w:rPr>
+          <w:iCs/>
+          <w:i/>
+        </w:rPr>
+        <w:t xml:space="preserve"> </w:t>
+      </w:r>
+      <w:r>
+        <w:rPr>
+          <w:rStyle w:val="VerbatimChar"/>
+          <w:iCs/>
+          <w:i/>
+        </w:rPr>
+        <w:t xml:space="preserve">make train-distilbert --render</w:t>
+      </w:r>
+      <w:r>
+        <w:rPr>
+          <w:iCs/>
+          <w:i/>
+        </w:rPr>
+        <w:t xml:space="preserve">)</w:t>
       </w:r>
     </w:p>
     <w:p>
@@ -3785,7 +4159,20 @@
         <w:t xml:space="preserve"> </w:t>
       </w:r>
       <w:r>
-        <w:t xml:space="preserve">WELFake and ISOT (in-domain).</w:t>
+        <w:t xml:space="preserve">WELFake and ISOT (in-domain). — NB/LR/SVM done on both;</w:t>
+      </w:r>
+      <w:r>
+        <w:t xml:space="preserve"> </w:t>
+      </w:r>
+      <w:r>
+        <w:rPr>
+          <w:bCs/>
+          <w:b/>
+        </w:rPr>
+        <w:t xml:space="preserve">DistilBERT row deferred to ESE</w:t>
+      </w:r>
+      <w:r>
+        <w:t xml:space="preserve">.</w:t>
       </w:r>
     </w:p>
     <w:p>
@@ -3797,7 +4184,7 @@
         <w:pStyle w:val="Compact"/>
       </w:pPr>
       <w:r>
-        <w:t xml:space="preserve">☐ Cross-dataset table has all four cells (W∖I→W∖I, W∖I→I, I→W∖I, I→I, where W∖I = WELFake minus the ISOT articles) × {raw, artefact-removed}; F1 drop quantified in one sentence; the overlap (≈ 99.6 % of ISOT inside WELFake) stated next to the table.</w:t>
+        <w:t xml:space="preserve">☒ Cross-dataset table has all four cells (W∖I→W∖I, W∖I→I, I→W∖I, I→I, where W∖I = WELFake minus the ISOT articles) × {raw, artefact-removed}; F1 drop quantified in one sentence; the overlap (≈ 99.6 % of ISOT inside WELFake) stated next to the table.</w:t>
       </w:r>
     </w:p>
     <w:p>
@@ -3809,7 +4196,7 @@
         <w:pStyle w:val="Compact"/>
       </w:pPr>
       <w:r>
-        <w:t xml:space="preserve">☐ Artefact-only classifier accuracy on ISOT reported (expected very high) and discussed as leakage.</w:t>
+        <w:t xml:space="preserve">☒ Artefact-only classifier accuracy on ISOT reported (expected very high) and discussed as leakage.</w:t>
       </w:r>
     </w:p>
     <w:p>
@@ -3821,7 +4208,20 @@
         <w:pStyle w:val="Compact"/>
       </w:pPr>
       <w:r>
-        <w:t xml:space="preserve">☐ CM + ROC figures exist for every model; DistilBERT CM annotated with counts and percentages.</w:t>
+        <w:t xml:space="preserve">☐ CM + ROC figures exist for every model; DistilBERT CM annotated with counts and percentages. — done for NB/LR/SVM × WELFake/ISOT;</w:t>
+      </w:r>
+      <w:r>
+        <w:t xml:space="preserve"> </w:t>
+      </w:r>
+      <w:r>
+        <w:rPr>
+          <w:bCs/>
+          <w:b/>
+        </w:rPr>
+        <w:t xml:space="preserve">DistilBERT CM deferred to ESE</w:t>
+      </w:r>
+      <w:r>
+        <w:t xml:space="preserve">.</w:t>
       </w:r>
     </w:p>
     <w:p>
@@ -3833,7 +4233,7 @@
         <w:pStyle w:val="Compact"/>
       </w:pPr>
       <w:r>
-        <w:t xml:space="preserve">☐</w:t>
+        <w:t xml:space="preserve">☒</w:t>
       </w:r>
       <w:r>
         <w:t xml:space="preserve"> </w:t>
@@ -3849,6 +4249,16 @@
       </w:r>
       <w:r>
         <w:t xml:space="preserve">has ≥ 20 categorised examples and a category-frequency table.</w:t>
+      </w:r>
+      <w:r>
+        <w:t xml:space="preserve"> </w:t>
+      </w:r>
+      <w:r>
+        <w:rPr>
+          <w:iCs/>
+          <w:i/>
+        </w:rPr>
+        <w:t xml:space="preserve">(25 examples, 310 errors categorised, LinearSVC)</w:t>
       </w:r>
     </w:p>
     <w:p>
@@ -3860,7 +4270,23 @@
         <w:pStyle w:val="Compact"/>
       </w:pPr>
       <w:r>
-        <w:t xml:space="preserve">☐ Objective O1 checked: DistilBERT macro-F1 ≥ 0.95 on WELFake test (or the shortfall explained).</w:t>
+        <w:t xml:space="preserve">☐ Objective O1 checked: DistilBERT macro-F1 ≥ 0.95 on WELFake test (or the shortfall explained). —</w:t>
+      </w:r>
+      <w:r>
+        <w:t xml:space="preserve"> </w:t>
+      </w:r>
+      <w:r>
+        <w:rPr>
+          <w:bCs/>
+          <w:b/>
+        </w:rPr>
+        <w:t xml:space="preserve">not checked, deferred to ESE</w:t>
+      </w:r>
+      <w:r>
+        <w:t xml:space="preserve"> </w:t>
+      </w:r>
+      <w:r>
+        <w:t xml:space="preserve">(no DistilBERT test number; the 20k-subset val 0.987 must not be quoted as O1).</w:t>
       </w:r>
     </w:p>
     <w:p>
@@ -3872,7 +4298,7 @@
         <w:pStyle w:val="Compact"/>
       </w:pPr>
       <w:r>
-        <w:t xml:space="preserve">☐</w:t>
+        <w:t xml:space="preserve">☒</w:t>
       </w:r>
       <w:r>
         <w:t xml:space="preserve"> </w:t>
@@ -3888,6 +4314,16 @@
       </w:r>
       <w:r>
         <w:t xml:space="preserve">regenerates every number and figure above from the saved checkpoints.</w:t>
+      </w:r>
+      <w:r>
+        <w:t xml:space="preserve"> </w:t>
+      </w:r>
+      <w:r>
+        <w:rPr>
+          <w:iCs/>
+          <w:i/>
+        </w:rPr>
+        <w:t xml:space="preserve">(for the classical models)</w:t>
       </w:r>
     </w:p>
     <w:p>
@@ -4192,7 +4628,34 @@
         <w:t xml:space="preserve"> </w:t>
       </w:r>
       <w:r>
-        <w:t xml:space="preserve">3k balanced dev claims with gold Wikipedia evidence; NEI claims paired with a random sentence from the same page; accuracy / macro-F1 / CM. Caveat stated openly: FEVER-NLI is in the model’s pre-training mix, so the score is optimistic for news-domain evidence.</w:t>
+        <w:t xml:space="preserve">3k balanced dev claims with gold Wikipedia evidence (text from</w:t>
+      </w:r>
+      <w:r>
+        <w:t xml:space="preserve"> </w:t>
+      </w:r>
+      <w:r>
+        <w:rPr>
+          <w:rStyle w:val="VerbatimChar"/>
+        </w:rPr>
+        <w:t xml:space="preserve">copenlu/fever_gold_evidence</w:t>
+      </w:r>
+      <w:r>
+        <w:t xml:space="preserve">, premise =</w:t>
+      </w:r>
+      <w:r>
+        <w:t xml:space="preserve"> </w:t>
+      </w:r>
+      <w:r>
+        <w:t xml:space="preserve">“</w:t>
+      </w:r>
+      <w:r>
+        <w:t xml:space="preserve">Page title: sentence</w:t>
+      </w:r>
+      <w:r>
+        <w:t xml:space="preserve">”</w:t>
+      </w:r>
+      <w:r>
+        <w:t xml:space="preserve">); NEI claims paired with the Papelo-retrieved sentences shipped for them; accuracy / macro-F1 / CM. Zero-shot: the model card lists SNLI + MultiNLI only, no FEVER. Result 0.7267 accuracy / 0.7121 macro-F1 — O4 (≥ 0.85) not met; 47.9 % of NEI pairs are predicted REFUTES. Still optimistic for news-domain evidence (FEVER claims are short rewrites of the gold sentence).</w:t>
       </w:r>
     </w:p>
     <w:p>
@@ -4492,7 +4955,7 @@
         <w:pStyle w:val="Compact"/>
       </w:pPr>
       <w:r>
-        <w:t xml:space="preserve">☐ Every module named in §IV exists as code under</w:t>
+        <w:t xml:space="preserve">☒ Every module named in §IV exists as code under</w:t>
       </w:r>
       <w:r>
         <w:t xml:space="preserve"> </w:t>
@@ -4519,7 +4982,7 @@
         <w:pStyle w:val="Compact"/>
       </w:pPr>
       <w:r>
-        <w:t xml:space="preserve">☐ Rule table in the paper equals</w:t>
+        <w:t xml:space="preserve">☒ Rule table in the paper equals</w:t>
       </w:r>
       <w:r>
         <w:t xml:space="preserve"> </w:t>
@@ -4550,6 +5013,16 @@
       </w:r>
       <w:r>
         <w:t xml:space="preserve">(τ = 0.6, N = 6, k = 5).</w:t>
+      </w:r>
+      <w:r>
+        <w:t xml:space="preserve"> </w:t>
+      </w:r>
+      <w:r>
+        <w:rPr>
+          <w:iCs/>
+          <w:i/>
+        </w:rPr>
+        <w:t xml:space="preserve">(incl. the LANG pre-check)</w:t>
       </w:r>
     </w:p>
     <w:p>
@@ -4561,7 +5034,7 @@
         <w:pStyle w:val="Compact"/>
       </w:pPr>
       <w:r>
-        <w:t xml:space="preserve">☐ Pipeline figure has the same boxes as §9 of the master doc; dataset table numbers equal</w:t>
+        <w:t xml:space="preserve">☒ Pipeline figure has the same boxes as §9 of the master doc; dataset table numbers equal</w:t>
       </w:r>
       <w:r>
         <w:t xml:space="preserve"> </w:t>
@@ -4577,6 +5050,31 @@
       </w:r>
       <w:r>
         <w:t xml:space="preserve">output.</w:t>
+      </w:r>
+      <w:r>
+        <w:t xml:space="preserve"> </w:t>
+      </w:r>
+      <w:r>
+        <w:rPr>
+          <w:iCs/>
+          <w:i/>
+        </w:rPr>
+        <w:t xml:space="preserve">(</w:t>
+      </w:r>
+      <w:r>
+        <w:rPr>
+          <w:rStyle w:val="VerbatimChar"/>
+          <w:iCs/>
+          <w:i/>
+        </w:rPr>
+        <w:t xml:space="preserve">paper/figures/pipeline.{tex,pdf}</w:t>
+      </w:r>
+      <w:r>
+        <w:rPr>
+          <w:iCs/>
+          <w:i/>
+        </w:rPr>
+        <w:t xml:space="preserve">, TikZ; UI and LIME boxes folded into input/output since they are ESE)</w:t>
       </w:r>
     </w:p>
     <w:p>
@@ -4588,7 +5086,17 @@
         <w:pStyle w:val="Compact"/>
       </w:pPr>
       <w:r>
-        <w:t xml:space="preserve">☐ §V lists seed 42, 80/10/10 split, the winning hyperparameters, RTX 2050/3050-class 4 GB / Colab T4, library versions.</w:t>
+        <w:t xml:space="preserve">☒ §V lists seed 42, 80/10/10 split, the winning hyperparameters, RTX 2050/3050-class 4 GB / Colab T4, library versions.</w:t>
+      </w:r>
+      <w:r>
+        <w:t xml:space="preserve"> </w:t>
+      </w:r>
+      <w:r>
+        <w:rPr>
+          <w:iCs/>
+          <w:i/>
+        </w:rPr>
+        <w:t xml:space="preserve">(classical winners; DistilBERT winner deferred)</w:t>
       </w:r>
     </w:p>
     <w:p>
@@ -5083,7 +5591,7 @@
         <w:pStyle w:val="Compact"/>
       </w:pPr>
       <w:r>
-        <w:t xml:space="preserve">☐ Every number in §VI equals the corresponding cell in</w:t>
+        <w:t xml:space="preserve">☒ Every number in §VI equals the corresponding cell in</w:t>
       </w:r>
       <w:r>
         <w:t xml:space="preserve"> </w:t>
@@ -5110,7 +5618,17 @@
         <w:pStyle w:val="Compact"/>
       </w:pPr>
       <w:r>
-        <w:t xml:space="preserve">☐ Tables: model comparison, tuning, cross-dataset, stance; Figures: pipeline, CM, ROC, sweep curve.</w:t>
+        <w:t xml:space="preserve">☒ Tables: model comparison, tuning, cross-dataset, stance; Figures: pipeline, CM, ROC, sweep curve.</w:t>
+      </w:r>
+      <w:r>
+        <w:t xml:space="preserve"> </w:t>
+      </w:r>
+      <w:r>
+        <w:rPr>
+          <w:iCs/>
+          <w:i/>
+        </w:rPr>
+        <w:t xml:space="preserve">(sweep shown as a table — only 3 points at one max_len; stance CM, WELFake ROC)</w:t>
       </w:r>
     </w:p>
     <w:p>
@@ -5122,7 +5640,7 @@
         <w:pStyle w:val="Compact"/>
       </w:pPr>
       <w:r>
-        <w:t xml:space="preserve">☐ Each table has one paragraph of interpretation (what it shows, what it implies).</w:t>
+        <w:t xml:space="preserve">☒ Each table has one paragraph of interpretation (what it shows, what it implies).</w:t>
       </w:r>
     </w:p>
     <w:p>
@@ -5149,7 +5667,25 @@
         <w:t xml:space="preserve">”</w:t>
       </w:r>
       <w:r>
-        <w:t xml:space="preserve">; ESE additions listed in one sentence.</w:t>
+        <w:t xml:space="preserve">; ESE additions listed in one sentence. — no e2e numbers exist yet; the paper says</w:t>
+      </w:r>
+      <w:r>
+        <w:t xml:space="preserve"> </w:t>
+      </w:r>
+      <w:r>
+        <w:t xml:space="preserve">“</w:t>
+      </w:r>
+      <w:r>
+        <w:t xml:space="preserve">deferred to ESE</w:t>
+      </w:r>
+      <w:r>
+        <w:t xml:space="preserve">”</w:t>
+      </w:r>
+      <w:r>
+        <w:t xml:space="preserve"> </w:t>
+      </w:r>
+      <w:r>
+        <w:t xml:space="preserve">and lists the ESE additions in one sentence.</w:t>
       </w:r>
     </w:p>
     <w:p>
@@ -5161,7 +5697,7 @@
         <w:pStyle w:val="Compact"/>
       </w:pPr>
       <w:r>
-        <w:t xml:space="preserve">☐ Draft ≈ 5 pages total (§I–VI), compiles with</w:t>
+        <w:t xml:space="preserve">☒ Draft ≈ 5 pages total (§I–VI), compiles with</w:t>
       </w:r>
       <w:r>
         <w:t xml:space="preserve"> </w:t>
@@ -5174,6 +5710,16 @@
       </w:r>
       <w:r>
         <w:t xml:space="preserve">.</w:t>
+      </w:r>
+      <w:r>
+        <w:t xml:space="preserve"> </w:t>
+      </w:r>
+      <w:r>
+        <w:rPr>
+          <w:iCs/>
+          <w:i/>
+        </w:rPr>
+        <w:t xml:space="preserve">(8 pp. incl. references and stub §VII–VIII)</w:t>
       </w:r>
     </w:p>
     <w:p>
@@ -6553,7 +7099,39 @@
               <w:jc w:val="left"/>
             </w:pPr>
             <w:r>
-              <w:t xml:space="preserve">Pre-trained NLI meets the O4 target on FEVER; fine-tuning is optional and listed as a stretch goal.</w:t>
+              <w:t xml:space="preserve">Correct — and zero-shot it does</w:t>
+            </w:r>
+            <w:r>
+              <w:t xml:space="preserve"> </w:t>
+            </w:r>
+            <w:r>
+              <w:rPr>
+                <w:bCs/>
+                <w:b/>
+              </w:rPr>
+              <w:t xml:space="preserve">not</w:t>
+            </w:r>
+            <w:r>
+              <w:t xml:space="preserve"> </w:t>
+            </w:r>
+            <w:r>
+              <w:t xml:space="preserve">meet O4 on FEVER (0.7267 vs ≥ 0.85; the NEI class is the weak spot). Planned ESE fixes: REFUTES threshold tuned on FEVER</w:t>
+            </w:r>
+            <w:r>
+              <w:t xml:space="preserve"> </w:t>
+            </w:r>
+            <w:r>
+              <w:rPr>
+                <w:iCs/>
+                <w:i/>
+              </w:rPr>
+              <w:t xml:space="preserve">train</w:t>
+            </w:r>
+            <w:r>
+              <w:t xml:space="preserve"> </w:t>
+            </w:r>
+            <w:r>
+              <w:t xml:space="preserve">pairs, then the optional 1-epoch fine-tune.</w:t>
             </w:r>
           </w:p>
         </w:tc>

</xml_diff>

<commit_message>
Docs: label expected (not measured) values for experiments deferred to ESE
Co-Authored-By: Claude Opus 5.5 <noreply@anthropic.com>
</commit_message>
<xml_diff>
--- a/docs/milestones/MSE2_ProjectDetails.docx
+++ b/docs/milestones/MSE2_ProjectDetails.docx
@@ -340,7 +340,158 @@
         <w:t xml:space="preserve"> </w:t>
       </w:r>
       <w:r>
-        <w:t xml:space="preserve">(fusion.yaml values are untuned defaults) and all end-to-end numbers. Each DoD box below is ticked only if genuinely done; open boxes carry the reason.</w:t>
+        <w:t xml:space="preserve">(fusion.yaml values are untuned defaults) and all end-to-end numbers.</w:t>
+      </w:r>
+      <w:r>
+        <w:t xml:space="preserve"> </w:t>
+      </w:r>
+      <w:r>
+        <w:rPr>
+          <w:bCs/>
+          <w:b/>
+        </w:rPr>
+        <w:t xml:space="preserve">Expected — not measured</w:t>
+      </w:r>
+      <w:r>
+        <w:t xml:space="preserve"> </w:t>
+      </w:r>
+      <w:r>
+        <w:t xml:space="preserve">(†expected, not measured; to be replaced by the ESE run; no DoD box is ticked on this basis): DistilBERT full-train WELFake test macro-F1</w:t>
+      </w:r>
+      <w:r>
+        <w:t xml:space="preserve"> </w:t>
+      </w:r>
+      <w:r>
+        <w:rPr>
+          <w:iCs/>
+          <w:i/>
+        </w:rPr>
+        <w:t xml:space="preserve">≈ 0.98–0.99</w:t>
+      </w:r>
+      <w:r>
+        <w:t xml:space="preserve">† (basis: 20k-subset val 0.9863–0.9871, classical WELFake val–test gaps within ±0.003), so O1 is</w:t>
+      </w:r>
+      <w:r>
+        <w:t xml:space="preserve"> </w:t>
+      </w:r>
+      <w:r>
+        <w:rPr>
+          <w:iCs/>
+          <w:i/>
+        </w:rPr>
+        <w:t xml:space="preserve">expected</w:t>
+      </w:r>
+      <w:r>
+        <w:t xml:space="preserve"> </w:t>
+      </w:r>
+      <w:r>
+        <w:t xml:space="preserve">met† but not checked; DistilBERT ISOT test (in-domain)</w:t>
+      </w:r>
+      <w:r>
+        <w:t xml:space="preserve"> </w:t>
+      </w:r>
+      <w:r>
+        <w:rPr>
+          <w:iCs/>
+          <w:i/>
+        </w:rPr>
+        <w:t xml:space="preserve">expected high</w:t>
+      </w:r>
+      <w:r>
+        <w:t xml:space="preserve">†; DistilBERT cross-dataset WELFake∖ISOT ↔ ISOT</w:t>
+      </w:r>
+      <w:r>
+        <w:t xml:space="preserve"> </w:t>
+      </w:r>
+      <w:r>
+        <w:rPr>
+          <w:iCs/>
+          <w:i/>
+        </w:rPr>
+        <w:t xml:space="preserve">expected to drop sharply like the classical models</w:t>
+      </w:r>
+      <w:r>
+        <w:t xml:space="preserve">† (SVM 0.6611 / 0.5480); fusion thresholds</w:t>
+      </w:r>
+      <w:r>
+        <w:t xml:space="preserve"> </w:t>
+      </w:r>
+      <w:r>
+        <w:rPr>
+          <w:iCs/>
+          <w:i/>
+        </w:rPr>
+        <w:t xml:space="preserve">τ 0.6, N 6 months, k 5</w:t>
+      </w:r>
+      <w:r>
+        <w:t xml:space="preserve">† = the current untuned</w:t>
+      </w:r>
+      <w:r>
+        <w:t xml:space="preserve"> </w:t>
+      </w:r>
+      <w:r>
+        <w:rPr>
+          <w:rStyle w:val="VerbatimChar"/>
+        </w:rPr>
+        <w:t xml:space="preserve">fusion.yaml</w:t>
+      </w:r>
+      <w:r>
+        <w:t xml:space="preserve"> </w:t>
+      </w:r>
+      <w:r>
+        <w:t xml:space="preserve">defaults; end-to-end Live Claims 5-class = the O6</w:t>
+      </w:r>
+      <w:r>
+        <w:t xml:space="preserve"> </w:t>
+      </w:r>
+      <w:r>
+        <w:rPr>
+          <w:bCs/>
+          <w:b/>
+        </w:rPr>
+        <w:t xml:space="preserve">target</w:t>
+      </w:r>
+      <w:r>
+        <w:t xml:space="preserve">† (macro-F1 ≥ 0.55, UNVERIFIABLE precision ≥ 0.7), not a prediction. Details:</w:t>
+      </w:r>
+      <w:r>
+        <w:t xml:space="preserve"> </w:t>
+      </w:r>
+      <w:r>
+        <w:rPr>
+          <w:rStyle w:val="VerbatimChar"/>
+        </w:rPr>
+        <w:t xml:space="preserve">docs/results/distilbert_sweep.md</w:t>
+      </w:r>
+      <w:r>
+        <w:t xml:space="preserve">,</w:t>
+      </w:r>
+      <w:r>
+        <w:t xml:space="preserve"> </w:t>
+      </w:r>
+      <w:r>
+        <w:rPr>
+          <w:rStyle w:val="VerbatimChar"/>
+        </w:rPr>
+        <w:t xml:space="preserve">docs/results/classifier_table.md</w:t>
+      </w:r>
+      <w:r>
+        <w:t xml:space="preserve">, paper §VI (Table</w:t>
+      </w:r>
+      <w:r>
+        <w:t xml:space="preserve"> </w:t>
+      </w:r>
+      <w:r>
+        <w:t xml:space="preserve">“</w:t>
+      </w:r>
+      <w:r>
+        <w:t xml:space="preserve">Expected outcomes</w:t>
+      </w:r>
+      <w:r>
+        <w:t xml:space="preserve">”</w:t>
+      </w:r>
+      <w:r>
+        <w:t xml:space="preserve">). Each DoD box below is ticked only if genuinely done; open boxes carry the reason.</w:t>
       </w:r>
     </w:p>
     <w:bookmarkStart w:id="21" w:name="title-block"/>

</xml_diff>